<commit_message>
docs(reports): reports and presentations
</commit_message>
<xml_diff>
--- a/reports/InsightfulCell_Project_Report.docx
+++ b/reports/InsightfulCell_Project_Report.docx
@@ -237,7 +237,7 @@
                 <w:sz w:val="18"/>
                 <w:szCs w:val="18"/>
               </w:rPr>
-              <w:t>18 October 2026 · updated 19 October 2026 (version 1.1) and 21 October 2026 (version 1.2)</w:t>
+              <w:t>18 October 2026 · updated 19 October 2026 (version 1.1) 21 October 2026 (version 1.2) and 22 October 2026 (version 1.3)</w:t>
             </w:r>
           </w:p>
         </w:tc>
@@ -377,7 +377,7 @@
                 <w:sz w:val="18"/>
                 <w:szCs w:val="18"/>
               </w:rPr>
-              <w:t xml:space="preserve">Source code at commit a3b0b3d (main) · baseline system map v1.1 / PRD v1.2 (7 Oct 2026) for intent · version 1.1 checked against the working tree of 19 Oct 2026 · version 1.2 checked against commit 7c67a4d (21 Oct 2026)</w:t>
+              <w:t xml:space="preserve">Source code at commit a3b0b3d (main) · baseline system map v1.1 / PRD v1.2 (7 Oct 2026) for intent · version 1.1 checked against the working tree of 19 Oct 2026 · version 1.2 checked against commit 7c67a4d (21 Oct 2026) · version 1.3 checked against commit 1d29671 and the live AWS deployment (22 Oct 2026)</w:t>
             </w:r>
           </w:p>
         </w:tc>
@@ -1077,6 +1077,132 @@
                 <w:szCs w:val="18"/>
               </w:rPr>
               <w:t xml:space="preserve">Updated for iteration 24 and the 21 Oct commits: backup model (Gemini → gpt-4o-mini) and hard model spend cap with a spend ledger (migrations 0011–0012); admin dashboard behind a key; email sign-in link page limited to listed addresses, confirm and show password; 2 MiB body cap on the web proxy (part of F-08); self-hosted S3 in production and an Azure deployment recipe validated locally; results of the 21 Oct test run</w:t>
+            </w:r>
+          </w:p>
+        </w:tc>
+      </w:tr>
+      <w:tr>
+        <w:trPr>
+          <w:cantSplit/>
+          <w:tblHeader w:val="off"/>
+        </w:trPr>
+        <w:tc>
+          <w:tcPr>
+            <w:tcW w:type="dxa" w:w="1117"/>
+            <w:tcBorders>
+              <w:top w:val="single" w:color="C9D3D0" w:sz="4"/>
+              <w:left w:val="single" w:color="C9D3D0" w:sz="4"/>
+              <w:bottom w:val="single" w:color="C9D3D0" w:sz="4"/>
+              <w:right w:val="single" w:color="C9D3D0" w:sz="4"/>
+            </w:tcBorders>
+            <w:tcMar>
+              <w:top w:type="dxa" w:w="70"/>
+              <w:left w:type="dxa" w:w="110"/>
+              <w:bottom w:type="dxa" w:w="70"/>
+              <w:right w:type="dxa" w:w="110"/>
+            </w:tcMar>
+            <w:vAlign w:val="top"/>
+          </w:tcPr>
+          <w:p>
+            <w:pPr>
+              <w:spacing w:after="40"/>
+            </w:pPr>
+            <w:r>
+              <w:rPr>
+                <w:sz w:val="18"/>
+                <w:szCs w:val="18"/>
+              </w:rPr>
+              <w:t xml:space="preserve">1.3</w:t>
+            </w:r>
+          </w:p>
+        </w:tc>
+        <w:tc>
+          <w:tcPr>
+            <w:tcW w:type="dxa" w:w="1536"/>
+            <w:tcBorders>
+              <w:top w:val="single" w:color="C9D3D0" w:sz="4"/>
+              <w:left w:val="single" w:color="C9D3D0" w:sz="4"/>
+              <w:bottom w:val="single" w:color="C9D3D0" w:sz="4"/>
+              <w:right w:val="single" w:color="C9D3D0" w:sz="4"/>
+            </w:tcBorders>
+            <w:tcMar>
+              <w:top w:type="dxa" w:w="70"/>
+              <w:left w:type="dxa" w:w="110"/>
+              <w:bottom w:type="dxa" w:w="70"/>
+              <w:right w:type="dxa" w:w="110"/>
+            </w:tcMar>
+            <w:vAlign w:val="top"/>
+          </w:tcPr>
+          <w:p>
+            <w:pPr>
+              <w:spacing w:after="40"/>
+            </w:pPr>
+            <w:r>
+              <w:rPr>
+                <w:sz w:val="18"/>
+                <w:szCs w:val="18"/>
+              </w:rPr>
+              <w:t xml:space="preserve">22 Oct 2026</w:t>
+            </w:r>
+          </w:p>
+        </w:tc>
+        <w:tc>
+          <w:tcPr>
+            <w:tcW w:type="dxa" w:w="2793"/>
+            <w:tcBorders>
+              <w:top w:val="single" w:color="C9D3D0" w:sz="4"/>
+              <w:left w:val="single" w:color="C9D3D0" w:sz="4"/>
+              <w:bottom w:val="single" w:color="C9D3D0" w:sz="4"/>
+              <w:right w:val="single" w:color="C9D3D0" w:sz="4"/>
+            </w:tcBorders>
+            <w:tcMar>
+              <w:top w:type="dxa" w:w="70"/>
+              <w:left w:type="dxa" w:w="110"/>
+              <w:bottom w:type="dxa" w:w="70"/>
+              <w:right w:type="dxa" w:w="110"/>
+            </w:tcMar>
+            <w:vAlign w:val="top"/>
+          </w:tcPr>
+          <w:p>
+            <w:pPr>
+              <w:spacing w:after="40"/>
+            </w:pPr>
+            <w:r>
+              <w:rPr>
+                <w:sz w:val="18"/>
+                <w:szCs w:val="18"/>
+              </w:rPr>
+              <w:t xml:space="preserve">Claude (for Rupesh Ghimire)</w:t>
+            </w:r>
+          </w:p>
+        </w:tc>
+        <w:tc>
+          <w:tcPr>
+            <w:tcW w:type="dxa" w:w="4192"/>
+            <w:tcBorders>
+              <w:top w:val="single" w:color="C9D3D0" w:sz="4"/>
+              <w:left w:val="single" w:color="C9D3D0" w:sz="4"/>
+              <w:bottom w:val="single" w:color="C9D3D0" w:sz="4"/>
+              <w:right w:val="single" w:color="C9D3D0" w:sz="4"/>
+            </w:tcBorders>
+            <w:tcMar>
+              <w:top w:type="dxa" w:w="70"/>
+              <w:left w:type="dxa" w:w="110"/>
+              <w:bottom w:type="dxa" w:w="70"/>
+              <w:right w:type="dxa" w:w="110"/>
+            </w:tcMar>
+            <w:vAlign w:val="top"/>
+          </w:tcPr>
+          <w:p>
+            <w:pPr>
+              <w:spacing w:after="40"/>
+            </w:pPr>
+            <w:r>
+              <w:rPr>
+                <w:sz w:val="18"/>
+                <w:szCs w:val="18"/>
+              </w:rPr>
+              <w:t xml:space="preserve">Updated for the AWS deployment (22 Oct 2026): the application is live on one EC2 instance behind Caddy with HTTPS, uploads in Amazon S3 through the instance role, nightly database backups to S3, and images built by a GitHub Actions workflow; upload URLs now use the bucket’s regional host; a Playwright journey on the live site; the Azure recipe is superseded</w:t>
             </w:r>
           </w:p>
         </w:tc>
@@ -2494,7 +2620,7 @@
         <w:spacing w:after="120" w:line="276"/>
       </w:pPr>
       <w:r>
-        <w:t xml:space="preserve">The project has delivered six of its eight planned phases in about ten days of development (8–17 October 2026): identity and tenancy, uploads, a PostgreSQL-backed job queue with live progress, the full two-phase analysis pipeline, narration with a sentence verifier, and the reading experience (report, dashboard, exports, drill-downs, deletion). Question answering (Phase 7) and production operations (Phase 8) remain. Since 19 October the project has added cost controls for a public demo (a backup model, a hard model spend cap and a key-locked admin dashboard) and a deployment recipe for one Azure VM, validated locally only.</w:t>
+        <w:t xml:space="preserve">The project has delivered six of its eight planned phases in about ten days of development (8–17 October 2026): identity and tenancy, uploads, a PostgreSQL-backed job queue with live progress, the full two-phase analysis pipeline, narration with a sentence verifier, and the reading experience (report, dashboard, exports, drill-downs, deletion). Question answering (Phase 7) and production operations (Phase 8) remain. Since 19 October the project has added cost controls for a public demo (a backup model, a hard model spend cap and a key-locked admin dashboard) and a deployment recipe. On 22 October it went live on AWS (app.ic.rgproject.me): one EC2 instance runs the database, API, worker and web app under Docker Compose behind an HTTPS proxy, with uploads in Amazon S3 and nightly backups. No application code changed for it beyond signing upload links for the bucket’s regional host.</w:t>
       </w:r>
     </w:p>
     <w:tbl>
@@ -2782,7 +2908,7 @@
                 <w:sz w:val="18"/>
                 <w:szCs w:val="18"/>
               </w:rPr>
-              <w:t>715 backend tests (93.02% coverage) and 422 frontend tests passing in the full gate on 21 Oct 2026; 7 browser tests (5 journeys last run 18 Oct; 2 admin-dashboard tests added 21 Oct, not run here)</w:t>
+              <w:t xml:space="preserve">715 backend tests (93.02% coverage) and 422 frontend tests passing in the full gate on 21 Oct 2026; 719 backend tests on 22 Oct (4 added for S3 upload links; the 530 unit tests re-run and pass); 7 browser tests (5 journeys last run 18 Oct; 2 admin-dashboard tests added 21 Oct, not run here); the full journey re-driven on the live AWS site on 22 Oct</w:t>
             </w:r>
           </w:p>
         </w:tc>
@@ -3050,7 +3176,7 @@
                 <w:sz w:val="18"/>
                 <w:szCs w:val="18"/>
               </w:rPr>
-              <w:t xml:space="preserve">Phases 0–6 done, plus cost controls and an admin dashboard (21 Oct); 7 (Q&amp;A) and 8 (running it) not started; Release 1 alpha planned 11 Dec 2026</w:t>
+              <w:t xml:space="preserve">Phases 0–6 done, plus cost controls and an admin dashboard (21 Oct); deployed to production on AWS (22 Oct), the first part of Phase 8; 7 (Q&amp;A) and the rest of 8 (staging, monitoring, audit log) not started; Release 1 alpha planned 11 Dec 2026</w:t>
             </w:r>
           </w:p>
         </w:tc>
@@ -3118,7 +3244,7 @@
                 <w:sz w:val="20"/>
                 <w:szCs w:val="20"/>
               </w:rPr>
-              <w:t>The foundations are unusually solid for the project’s age: strong tenant isolation, a clean layered backend, provenance on every fact, and broad automated testing. The companion test report finds the security core sound but identifies correctness defects in data cleaning that must be fixed before real users rely on it, and a broken language-model path (F-01, fixed on 19 Oct), and notes that production operations are not yet built.</w:t>
+              <w:t>The foundations are unusually solid for the project’s age: strong tenant isolation, a clean layered backend, provenance on every fact, and broad automated testing. The companion test report finds the security core sound but identifies correctness defects in data cleaning that must be fixed before real users rely on it, and a broken language-model path (F-01, fixed on 19 Oct), and notes that production operations are only partly built: since 22 Oct 2026 the product runs on one AWS host with nightly backups, but staging, monitoring and an audit log are still missing.</w:t>
             </w:r>
           </w:p>
         </w:tc>
@@ -8276,7 +8402,7 @@
                 <w:sz w:val="18"/>
                 <w:szCs w:val="18"/>
               </w:rPr>
-              <w:t xml:space="preserve">Staging, production deploy, backups, retention, audit log (an Azure one-VM recipe exists, validated locally only)</w:t>
+              <w:t xml:space="preserve">Staging, production deploy, backups, retention, audit log. Production deploy and nightly backups exist since 22 Oct 2026 (one AWS EC2 host); staging, retention and audit log do not</w:t>
             </w:r>
           </w:p>
         </w:tc>
@@ -8307,7 +8433,7 @@
                 <w:sz w:val="18"/>
                 <w:szCs w:val="18"/>
               </w:rPr>
-              <w:t xml:space="preserve">○</w:t>
+              <w:t xml:space="preserve">◐</w:t>
             </w:r>
           </w:p>
         </w:tc>
@@ -9560,7 +9686,7 @@
                 <w:sz w:val="17"/>
                 <w:szCs w:val="17"/>
               </w:rPr>
-              <w:t xml:space="preserve">S3 API (RustFS 1.0 locally and in the Azure recipe, S3 in production)</w:t>
+              <w:t xml:space="preserve">S3 API (RustFS 1.0 locally, Amazon S3 in production on AWS)</w:t>
             </w:r>
           </w:p>
         </w:tc>
@@ -16140,7 +16266,7 @@
         <w:spacing w:after="120" w:line="276"/>
       </w:pPr>
       <w:r>
-        <w:t xml:space="preserve">Known gaps (detailed in the test report): no per-organisation rate limits, sign-in throttle keyed on X-Forwarded-For (overwritten by Caddy in the Azure recipe), unused invitation endpoints, no email verification; the proxy body cap was added in iteration 24. The admin dashboard uses one shared key with an in-memory attempt counter and shows every account’s name and email to whoever holds it. A deleted run’s cached table can stay on the API host for up to an hour, never served (ADR-040).</w:t>
+        <w:t xml:space="preserve">Known gaps (detailed in the test report): no per-organisation rate limits, sign-in throttle keyed on X-Forwarded-For (overwritten by Caddy on the AWS host), unused invitation endpoints, no email verification; the proxy body cap was added in iteration 24. The admin dashboard uses one shared key with an in-memory attempt counter and shows every account’s name and email to whoever holds it. A deleted run’s cached table can stay on the API host for up to an hour, never served (ADR-040).</w:t>
       </w:r>
     </w:p>
     <w:p>
@@ -17231,7 +17357,7 @@
           <wp:inline distT="0" distB="0" distL="0" distR="0">
             <wp:extent cx="6096000" cy="1571625"/>
             <wp:effectExtent t="0" r="0" b="0" l="0"/>
-            <wp:docPr id="16" name="deploy.png" descr="Deployment today and the target in the baseline." title="Deployment today and the target in the baseline."/>
+            <wp:docPr id="16" name="deploy.png" descr="Deployment today (one AWS host) and the target in the baseline." title="Deployment today (one AWS host) and the target in the baseline."/>
             <wp:cNvGraphicFramePr>
               <a:graphicFrameLocks xmlns:a="http://schemas.openxmlformats.org/drawingml/2006/main" noChangeAspect="1"/>
             </wp:cNvGraphicFramePr>
@@ -17290,7 +17416,7 @@
           <w:sz w:val="18"/>
           <w:szCs w:val="18"/>
         </w:rPr>
-        <w:t xml:space="preserve">Deployment today and the target in the baseline.</w:t>
+        <w:t xml:space="preserve">Deployment today (one AWS host) and the target in the baseline.</w:t>
       </w:r>
     </w:p>
     <w:tbl>
@@ -17831,7 +17957,7 @@
                 <w:sz w:val="18"/>
                 <w:szCs w:val="18"/>
               </w:rPr>
-              <w:t xml:space="preserve">Azure (one VM)</w:t>
+              <w:t xml:space="preserve">AWS production (one EC2 t3.micro)</w:t>
             </w:r>
           </w:p>
         </w:tc>
@@ -17861,7 +17987,7 @@
                 <w:sz w:val="18"/>
                 <w:szCs w:val="18"/>
               </w:rPr>
-              <w:t xml:space="preserve">Next.js standalone behind Caddy (HTTPS)</w:t>
+              <w:t xml:space="preserve">Next.js standalone container behind a shared Caddy proxy (Let’s Encrypt HTTPS)</w:t>
             </w:r>
           </w:p>
         </w:tc>
@@ -17891,7 +18017,7 @@
                 <w:sz w:val="18"/>
                 <w:szCs w:val="18"/>
               </w:rPr>
-              <w:t xml:space="preserve">API and worker containers</w:t>
+              <w:t xml:space="preserve">API and worker containers (one image, pulled from ghcr.io)</w:t>
             </w:r>
           </w:p>
         </w:tc>
@@ -17921,7 +18047,7 @@
                 <w:sz w:val="18"/>
                 <w:szCs w:val="18"/>
               </w:rPr>
-              <w:t xml:space="preserve">PostgreSQL 18 + RustFS in Compose; backups by script</w:t>
+              <w:t xml:space="preserve">PostgreSQL 18 container (private network); Amazon S3 via the instance role; nightly pg_dump to an S3 backups bucket; daily EBS snapshots</w:t>
             </w:r>
           </w:p>
         </w:tc>
@@ -17951,7 +18077,7 @@
                 <w:sz w:val="18"/>
                 <w:szCs w:val="18"/>
               </w:rPr>
-              <w:t xml:space="preserve">Recipe validated locally with Caddy’s local CA; no real VM yet</w:t>
+              <w:t xml:space="preserve">Live since 22 Oct 2026 at app.ic.rgproject.me; full journey checked with Playwright</w:t>
             </w:r>
           </w:p>
         </w:tc>
@@ -18098,7 +18224,7 @@
                 <w:sz w:val="18"/>
                 <w:szCs w:val="18"/>
               </w:rPr>
-              <w:t xml:space="preserve">Runs on GitHub since 19 Oct (two failures fixed in iteration 23); current status not checked here</w:t>
+              <w:t xml:space="preserve">Runs on GitHub since 19 Oct; since 22 Oct an Images workflow builds the api, web and web-tools images on every push to main and publishes them to ghcr.io for the server to pull</w:t>
             </w:r>
           </w:p>
         </w:tc>
@@ -18254,7 +18380,7 @@
                 <w:sz w:val="18"/>
                 <w:szCs w:val="18"/>
               </w:rPr>
-              <w:t xml:space="preserve">Not started</w:t>
+              <w:t xml:space="preserve">Not started (baseline target)</w:t>
             </w:r>
           </w:p>
         </w:tc>
@@ -18415,7 +18541,7 @@
                 <w:sz w:val="18"/>
                 <w:szCs w:val="18"/>
               </w:rPr>
-              <w:t xml:space="preserve">Not started</w:t>
+              <w:t xml:space="preserve">Baseline target; production runs on one EC2 host for now</w:t>
             </w:r>
           </w:p>
         </w:tc>
@@ -18425,6 +18551,30 @@
       <w:pPr>
         <w:spacing w:after="160"/>
       </w:pPr>
+    </w:p>
+    <w:p>
+      <w:pPr>
+        <w:spacing w:after="120" w:line="276"/>
+      </w:pPr>
+      <w:r>
+        <w:t xml:space="preserve">Production since 22 October 2026. The application runs on one AWS EC2 instance (t3.micro, Ubuntu 24.04, 4 GB swap) set up with the deploy/aws kit by the deployment owner. A shared Caddy container owns ports 80 and 443, obtains Let’s Encrypt certificates and routes app.ic.rgproject.me to the web app and api.ic.rgproject.me to the API, unbuffered for the live-progress stream. PostgreSQL 18, the API, the worker and the web app run under Docker Compose; PostgreSQL has no published port.</w:t>
+      </w:r>
+    </w:p>
+    <w:p>
+      <w:pPr>
+        <w:spacing w:after="120" w:line="276"/>
+      </w:pPr>
+      <w:r>
+        <w:t xml:space="preserve">Releases are pulled, not built, on the server: a GitHub Actions workflow (Images) builds the api, web and web-tools images on every push to main and pushes them to ghcr.io, tagged latest and with the commit SHA. deploy.sh pulls them, creates the database roles (the API’s login role cannot bypass row-level security), runs the migrations and starts the services; IC_IMAGE_TAG=&lt;sha&gt; deploys or rolls back one exact build. Secrets live only in three git-ignored env files on the server, and S3 access comes from the instance role, so there are no storage keys at all.</w:t>
+      </w:r>
+    </w:p>
+    <w:p>
+      <w:pPr>
+        <w:spacing w:after="120" w:line="276"/>
+      </w:pPr>
+      <w:r>
+        <w:t xml:space="preserve">Uploads go straight from the browser to a private S3 bucket whose CORS rule allows only the app. The only code change for AWS made the API sign part URLs for the bucket’s regional host, because the global host redirects and browsers cannot follow a redirect on a CORS upload. backup.sh streams a nightly pg_dump to a second bucket (30-day expiry), and daily EBS snapshots cover the volume. On 22 October no language model was configured on the host, so the live site plans with the rules and writes template sentences; a 5,000-row file went from upload to report in 14 seconds.</w:t>
+      </w:r>
     </w:p>
     <w:p>
       <w:pPr>
@@ -19551,6 +19701,14 @@
     </w:p>
     <w:p>
       <w:pPr>
+        <w:spacing w:after="120" w:line="276"/>
+      </w:pPr>
+      <w:r>
+        <w:t xml:space="preserve">22 Oct 2026, after the AWS deployment commits: 719 backend tests are collected (4 new tests check the regional host of S3 upload links) and the 530 backend unit tests pass. The integration and frontend suites, make check and the browser journeys were not re-run, since the only application change is in storage/s3.py and the web image’s build heap. Instead, the full journey was driven against the live site with Playwright (register, upload, duplicate check, automatic and manual runs, review gate, report, fact inspector, See the data, dashboard and maps, all four downloads, a drill-down) and every step passed. The committed backend/uv.lock still pins certifi 2026.7.22 and pillow 12.3.0, so the deployed image carries the 9 advisories found on 21 Oct.</w:t>
+      </w:r>
+    </w:p>
+    <w:p>
+      <w:pPr>
         <w:pStyle w:val="Heading1"/>
         <w:pageBreakBefore/>
       </w:pPr>
@@ -20835,7 +20993,7 @@
                 <w:sz w:val="18"/>
                 <w:szCs w:val="18"/>
               </w:rPr>
-              <w:t xml:space="preserve">Not started</w:t>
+              <w:t xml:space="preserve">Started</w:t>
             </w:r>
           </w:p>
         </w:tc>
@@ -20865,7 +21023,7 @@
                 <w:sz w:val="18"/>
                 <w:szCs w:val="18"/>
               </w:rPr>
-              <w:t xml:space="preserve">Staging, observability, hardening, retention, audit log</w:t>
+              <w:t xml:space="preserve">Done: production on AWS (one EC2 host, HTTPS, S3, nightly backups, CI-built images). Left: staging, observability, hardening, retention, audit log</w:t>
             </w:r>
           </w:p>
         </w:tc>
@@ -22016,6 +22174,105 @@
                 <w:szCs w:val="18"/>
               </w:rPr>
               <w:t xml:space="preserve">Public demo budget (21 Oct 2026); no ADR yet</w:t>
+            </w:r>
+          </w:p>
+        </w:tc>
+      </w:tr>
+      <w:tr>
+        <w:trPr>
+          <w:cantSplit/>
+          <w:tblHeader w:val="off"/>
+        </w:trPr>
+        <w:tc>
+          <w:tcPr>
+            <w:tcW w:type="dxa" w:w="3212"/>
+            <w:tcBorders>
+              <w:top w:val="single" w:color="C9D3D0" w:sz="4"/>
+              <w:left w:val="single" w:color="C9D3D0" w:sz="4"/>
+              <w:bottom w:val="single" w:color="C9D3D0" w:sz="4"/>
+              <w:right w:val="single" w:color="C9D3D0" w:sz="4"/>
+            </w:tcBorders>
+            <w:shd w:fill="F6F8F7" w:color="auto" w:val="clear"/>
+            <w:tcMar>
+              <w:top w:type="dxa" w:w="70"/>
+              <w:left w:type="dxa" w:w="110"/>
+              <w:bottom w:type="dxa" w:w="70"/>
+              <w:right w:type="dxa" w:w="110"/>
+            </w:tcMar>
+            <w:vAlign w:val="top"/>
+          </w:tcPr>
+          <w:p>
+            <w:pPr>
+              <w:spacing w:after="40"/>
+            </w:pPr>
+            <w:r>
+              <w:rPr>
+                <w:sz w:val="18"/>
+                <w:szCs w:val="18"/>
+              </w:rPr>
+              <w:t xml:space="preserve">Vercel + ECS Fargate + RDS Multi-AZ</w:t>
+            </w:r>
+          </w:p>
+        </w:tc>
+        <w:tc>
+          <w:tcPr>
+            <w:tcW w:type="dxa" w:w="3533"/>
+            <w:tcBorders>
+              <w:top w:val="single" w:color="C9D3D0" w:sz="4"/>
+              <w:left w:val="single" w:color="C9D3D0" w:sz="4"/>
+              <w:bottom w:val="single" w:color="C9D3D0" w:sz="4"/>
+              <w:right w:val="single" w:color="C9D3D0" w:sz="4"/>
+            </w:tcBorders>
+            <w:shd w:fill="F6F8F7" w:color="auto" w:val="clear"/>
+            <w:tcMar>
+              <w:top w:type="dxa" w:w="70"/>
+              <w:left w:type="dxa" w:w="110"/>
+              <w:bottom w:type="dxa" w:w="70"/>
+              <w:right w:type="dxa" w:w="110"/>
+            </w:tcMar>
+            <w:vAlign w:val="top"/>
+          </w:tcPr>
+          <w:p>
+            <w:pPr>
+              <w:spacing w:after="40"/>
+            </w:pPr>
+            <w:r>
+              <w:rPr>
+                <w:sz w:val="18"/>
+                <w:szCs w:val="18"/>
+              </w:rPr>
+              <w:t xml:space="preserve">One EC2 instance with Docker Compose, Caddy, PostgreSQL in a container, Amazon S3</w:t>
+            </w:r>
+          </w:p>
+        </w:tc>
+        <w:tc>
+          <w:tcPr>
+            <w:tcW w:type="dxa" w:w="2893"/>
+            <w:tcBorders>
+              <w:top w:val="single" w:color="C9D3D0" w:sz="4"/>
+              <w:left w:val="single" w:color="C9D3D0" w:sz="4"/>
+              <w:bottom w:val="single" w:color="C9D3D0" w:sz="4"/>
+              <w:right w:val="single" w:color="C9D3D0" w:sz="4"/>
+            </w:tcBorders>
+            <w:shd w:fill="F6F8F7" w:color="auto" w:val="clear"/>
+            <w:tcMar>
+              <w:top w:type="dxa" w:w="70"/>
+              <w:left w:type="dxa" w:w="110"/>
+              <w:bottom w:type="dxa" w:w="70"/>
+              <w:right w:type="dxa" w:w="110"/>
+            </w:tcMar>
+            <w:vAlign w:val="top"/>
+          </w:tcPr>
+          <w:p>
+            <w:pPr>
+              <w:spacing w:after="40"/>
+            </w:pPr>
+            <w:r>
+              <w:rPr>
+                <w:sz w:val="18"/>
+                <w:szCs w:val="18"/>
+              </w:rPr>
+              <w:t xml:space="preserve">Free-tier cost for a demo; RDS’s master user cannot create the BYPASSRLS role that migration 0001 needs (22 Oct 2026); no ADR yet</w:t>
             </w:r>
           </w:p>
         </w:tc>
@@ -22610,7 +22867,7 @@
                 <w:sz w:val="17"/>
                 <w:szCs w:val="17"/>
               </w:rPr>
-              <w:t xml:space="preserve">No production operations by Release 1 alpha (11 Dec 2026)</w:t>
+              <w:t xml:space="preserve">Production on a single small host (one EC2 t3.micro since 22 Oct 2026): no staging, no high availability, no monitoring or alerts by Release 1 alpha (11 Dec 2026)</w:t>
             </w:r>
           </w:p>
         </w:tc>
@@ -22700,7 +22957,7 @@
                 <w:sz w:val="17"/>
                 <w:szCs w:val="17"/>
               </w:rPr>
-              <w:t xml:space="preserve">Start Phase 8 in parallel with Phase 7</w:t>
+              <w:t xml:space="preserve">Add staging, metrics, alerts and a restore drill; resize the instance when runs queue; consider RDS once the BYPASSRLS migration is tested there</w:t>
             </w:r>
           </w:p>
         </w:tc>
@@ -22861,7 +23118,7 @@
                 <w:sz w:val="17"/>
                 <w:szCs w:val="17"/>
               </w:rPr>
-              <w:t xml:space="preserve">Rate limits, trusted IP header (Caddy overwrites it in the Azure recipe), disable unused routes; body cap done</w:t>
+              <w:t xml:space="preserve">Rate limits, trusted IP header (Caddy overwrites it on the AWS host), disable unused routes; body cap done</w:t>
             </w:r>
           </w:p>
         </w:tc>
@@ -23864,7 +24121,7 @@
                 <w:sz w:val="18"/>
                 <w:szCs w:val="18"/>
               </w:rPr>
-              <w:t>Fix test-report findings F-02 to F-06, F-12 (F-01 fixed 19 Oct); automate the sample-data answer key; write ADRs for the backup model, spend cap and admin dashboard; deploy the Azure recipe to a real VM</w:t>
+              <w:t>Fix test-report findings F-02 to F-06, F-12 (F-01 fixed 19 Oct); automate the sample-data answer key; write ADRs for the backup model, spend cap and admin dashboard; commit the dependency update for the 9 advisories (certifi, pillow) and redeploy; add a restore drill and basic monitoring to the AWS host</w:t>
             </w:r>
           </w:p>
         </w:tc>

</xml_diff>

<commit_message>
update(reports): made it all consistent
</commit_message>
<xml_diff>
--- a/reports/InsightfulCell_Project_Report.docx
+++ b/reports/InsightfulCell_Project_Report.docx
@@ -167,7 +167,7 @@
                 <w:sz w:val="18"/>
                 <w:szCs w:val="18"/>
               </w:rPr>
-              <w:t xml:space="preserve">Project report · release 0.6.0 (Phases 1–6)</w:t>
+              <w:t xml:space="preserve">Project report · release 0.6.0 (Phases 1-6)</w:t>
             </w:r>
           </w:p>
         </w:tc>
@@ -237,7 +237,7 @@
                 <w:sz w:val="18"/>
                 <w:szCs w:val="18"/>
               </w:rPr>
-              <w:t>18 October 2026 · updated 19 October 2026 (version 1.1) 21 October 2026 (version 1.2) and 22 October 2026 (version 1.3)</w:t>
+              <w:t xml:space="preserve">18 October 2026 · updated 19 October 2026 (version 1.1) 21 October 2026 (version 1.2) and 22 October 2026 (versions 1.3 and 1.4)</w:t>
             </w:r>
           </w:p>
         </w:tc>
@@ -950,7 +950,7 @@
                 <w:sz w:val="18"/>
                 <w:szCs w:val="18"/>
               </w:rPr>
-              <w:t>Updated for iterations 17–21: test finding F-01 fixed; sharing the local stack through one tunnel (ADR-038, ADR-039); “See the data” panel and GET /v1/runs/{id}/rows (ADR-040); commit-only git hooks; results of the 19 Oct test run</w:t>
+              <w:t>Updated for iterations 17-21: test finding F-01 fixed; sharing the local stack through one tunnel (ADR-038, ADR-039); “See the data” panel and GET /v1/runs/{id}/rows (ADR-040); commit-only git hooks; results of the 19 Oct test run</w:t>
             </w:r>
           </w:p>
         </w:tc>
@@ -1076,7 +1076,7 @@
                 <w:sz w:val="18"/>
                 <w:szCs w:val="18"/>
               </w:rPr>
-              <w:t xml:space="preserve">Updated for iteration 24 and the 21 Oct commits: backup model (Gemini → gpt-4o-mini) and hard model spend cap with a spend ledger (migrations 0011–0012); admin dashboard behind a key; email sign-in link page limited to listed addresses, confirm and show password; 2 MiB body cap on the web proxy (part of F-08); self-hosted S3 in production and an Azure deployment recipe validated locally; results of the 21 Oct test run</w:t>
+              <w:t xml:space="preserve">Updated for iteration 24 and the 21 Oct commits: backup model (Gemini → gpt-4o-mini) and hard model spend cap with a spend ledger (migrations 0011-0012); admin dashboard behind a key; confirm and show password on registration; 2 MiB body cap on the web proxy (part of F-08); self-hosted S3 in production; results of the 21 Oct test run</w:t>
             </w:r>
           </w:p>
         </w:tc>
@@ -1202,7 +1202,133 @@
                 <w:sz w:val="18"/>
                 <w:szCs w:val="18"/>
               </w:rPr>
-              <w:t xml:space="preserve">Updated for the AWS deployment (22 Oct 2026): the application is live on one EC2 instance behind Caddy with HTTPS, uploads in Amazon S3 through the instance role, nightly database backups to S3, and images built by a GitHub Actions workflow; upload URLs now use the bucket’s regional host; a Playwright journey on the live site; the Azure recipe is superseded</w:t>
+              <w:t xml:space="preserve">Updated for the AWS deployment (22 Oct 2026): the application is live on one EC2 instance behind Caddy with HTTPS, uploads in Amazon S3 through the instance role, nightly database backups to S3, and images built by a GitHub Actions workflow; upload URLs now use the bucket’s regional host; a Playwright journey on the live site</w:t>
+            </w:r>
+          </w:p>
+        </w:tc>
+      </w:tr>
+      <w:tr>
+        <w:trPr>
+          <w:cantSplit/>
+          <w:tblHeader w:val="off"/>
+        </w:trPr>
+        <w:tc>
+          <w:tcPr>
+            <w:tcW w:type="dxa" w:w="1117"/>
+            <w:tcBorders>
+              <w:top w:val="single" w:color="C9D3D0" w:sz="4"/>
+              <w:left w:val="single" w:color="C9D3D0" w:sz="4"/>
+              <w:bottom w:val="single" w:color="C9D3D0" w:sz="4"/>
+              <w:right w:val="single" w:color="C9D3D0" w:sz="4"/>
+            </w:tcBorders>
+            <w:tcMar>
+              <w:top w:type="dxa" w:w="70"/>
+              <w:left w:type="dxa" w:w="110"/>
+              <w:bottom w:type="dxa" w:w="70"/>
+              <w:right w:type="dxa" w:w="110"/>
+            </w:tcMar>
+            <w:vAlign w:val="top"/>
+          </w:tcPr>
+          <w:p>
+            <w:pPr>
+              <w:spacing w:after="40"/>
+            </w:pPr>
+            <w:r>
+              <w:rPr>
+                <w:sz w:val="18"/>
+                <w:szCs w:val="18"/>
+              </w:rPr>
+              <w:t xml:space="preserve">1.4</w:t>
+            </w:r>
+          </w:p>
+        </w:tc>
+        <w:tc>
+          <w:tcPr>
+            <w:tcW w:type="dxa" w:w="1536"/>
+            <w:tcBorders>
+              <w:top w:val="single" w:color="C9D3D0" w:sz="4"/>
+              <w:left w:val="single" w:color="C9D3D0" w:sz="4"/>
+              <w:bottom w:val="single" w:color="C9D3D0" w:sz="4"/>
+              <w:right w:val="single" w:color="C9D3D0" w:sz="4"/>
+            </w:tcBorders>
+            <w:tcMar>
+              <w:top w:type="dxa" w:w="70"/>
+              <w:left w:type="dxa" w:w="110"/>
+              <w:bottom w:type="dxa" w:w="70"/>
+              <w:right w:type="dxa" w:w="110"/>
+            </w:tcMar>
+            <w:vAlign w:val="top"/>
+          </w:tcPr>
+          <w:p>
+            <w:pPr>
+              <w:spacing w:after="40"/>
+            </w:pPr>
+            <w:r>
+              <w:rPr>
+                <w:sz w:val="18"/>
+                <w:szCs w:val="18"/>
+              </w:rPr>
+              <w:t xml:space="preserve">22 Oct 2026</w:t>
+            </w:r>
+          </w:p>
+        </w:tc>
+        <w:tc>
+          <w:tcPr>
+            <w:tcW w:type="dxa" w:w="2793"/>
+            <w:tcBorders>
+              <w:top w:val="single" w:color="C9D3D0" w:sz="4"/>
+              <w:left w:val="single" w:color="C9D3D0" w:sz="4"/>
+              <w:bottom w:val="single" w:color="C9D3D0" w:sz="4"/>
+              <w:right w:val="single" w:color="C9D3D0" w:sz="4"/>
+            </w:tcBorders>
+            <w:tcMar>
+              <w:top w:type="dxa" w:w="70"/>
+              <w:left w:type="dxa" w:w="110"/>
+              <w:bottom w:type="dxa" w:w="70"/>
+              <w:right w:type="dxa" w:w="110"/>
+            </w:tcMar>
+            <w:vAlign w:val="top"/>
+          </w:tcPr>
+          <w:p>
+            <w:pPr>
+              <w:spacing w:after="40"/>
+            </w:pPr>
+            <w:r>
+              <w:rPr>
+                <w:sz w:val="18"/>
+                <w:szCs w:val="18"/>
+              </w:rPr>
+              <w:t xml:space="preserve">Claude (for Rupesh Ghimire)</w:t>
+            </w:r>
+          </w:p>
+        </w:tc>
+        <w:tc>
+          <w:tcPr>
+            <w:tcW w:type="dxa" w:w="4192"/>
+            <w:tcBorders>
+              <w:top w:val="single" w:color="C9D3D0" w:sz="4"/>
+              <w:left w:val="single" w:color="C9D3D0" w:sz="4"/>
+              <w:bottom w:val="single" w:color="C9D3D0" w:sz="4"/>
+              <w:right w:val="single" w:color="C9D3D0" w:sz="4"/>
+            </w:tcBorders>
+            <w:tcMar>
+              <w:top w:type="dxa" w:w="70"/>
+              <w:left w:type="dxa" w:w="110"/>
+              <w:bottom w:type="dxa" w:w="70"/>
+              <w:right w:type="dxa" w:w="110"/>
+            </w:tcMar>
+            <w:vAlign w:val="top"/>
+          </w:tcPr>
+          <w:p>
+            <w:pPr>
+              <w:spacing w:after="40"/>
+            </w:pPr>
+            <w:r>
+              <w:rPr>
+                <w:sz w:val="18"/>
+                <w:szCs w:val="18"/>
+              </w:rPr>
+              <w:t xml:space="preserve">Product idea and taglines brought in line with the README and the site; features that are not released are no longer described; plainer wording</w:t>
             </w:r>
           </w:p>
         </w:tc>
@@ -1364,7 +1490,7 @@
                 <w:sz w:val="18"/>
                 <w:szCs w:val="18"/>
               </w:rPr>
-              <w:t xml:space="preserve">Understand what exists, what it is worth and what is left (sections 1, 3, 14–16)</w:t>
+              <w:t xml:space="preserve">Understand what exists, what it is worth and what is left (sections 1, 3, 14-16)</w:t>
             </w:r>
           </w:p>
         </w:tc>
@@ -1432,7 +1558,7 @@
                 <w:sz w:val="18"/>
                 <w:szCs w:val="18"/>
               </w:rPr>
-              <w:t xml:space="preserve">Navigate the architecture, components, data model and flows (sections 6–11)</w:t>
+              <w:t xml:space="preserve">Navigate the architecture, components, data model and flows (sections 6-11)</w:t>
             </w:r>
           </w:p>
         </w:tc>
@@ -2609,10 +2735,10 @@
           <w:b/>
           <w:bCs/>
         </w:rPr>
-        <w:t xml:space="preserve">InsightfulCell</w:t>
+        <w:t xml:space="preserve">InsightfulCell describes itself on its sign-in page as “your one stop solution for data analysis”. It is a web platform that turns an uploaded table</w:t>
       </w:r>
       <w:r>
-        <w:t xml:space="preserve"> is a web platform that turns an uploaded table (CSV, TSV, Excel, Parquet or JSON) into a cleaned dataset, statistically controlled findings, checked charts and maps, and a narrated report in which every number links to an immutable fact. Its positioning is trust: the statistics are computed by deterministic code, a language model only plans and writes, and everything the model produces is validated or verified before anyone sees it.</w:t>
+        <w:t xml:space="preserve"> (CSV, TSV, Excel, Parquet or JSON) into a cleaned dataset, statistically controlled findings, checked charts and maps, and a narrated report in which every number links to an immutable fact. Its positioning is trust: the statistics are computed by deterministic code, a language model only plans and writes, and everything the model produces is validated or verified before anyone sees it.</w:t>
       </w:r>
     </w:p>
     <w:p>
@@ -2620,7 +2746,7 @@
         <w:spacing w:after="120" w:line="276"/>
       </w:pPr>
       <w:r>
-        <w:t xml:space="preserve">The project has delivered six of its eight planned phases in about ten days of development (8–17 October 2026): identity and tenancy, uploads, a PostgreSQL-backed job queue with live progress, the full two-phase analysis pipeline, narration with a sentence verifier, and the reading experience (report, dashboard, exports, drill-downs, deletion). Question answering (Phase 7) and production operations (Phase 8) remain. Since 19 October the project has added cost controls for a public demo (a backup model, a hard model spend cap and a key-locked admin dashboard) and a deployment recipe. On 22 October it went live on AWS (app.ic.rgproject.me): one EC2 instance runs the database, API, worker and web app under Docker Compose behind an HTTPS proxy, with uploads in Amazon S3 and nightly backups. No application code changed for it beyond signing upload links for the bucket’s regional host.</w:t>
+        <w:t xml:space="preserve">The project has delivered six of its eight planned phases in about ten days of development (8-17 October 2026): identity and tenancy, uploads, a PostgreSQL-backed job queue with live progress, the full two-phase analysis pipeline, narration with a sentence verifier, and the reading experience (report, dashboard, exports, drill-downs, deletion). Question answering (Phase 7) and production operations (Phase 8) remain. Since 19 October the project has added cost controls for a public demo (a backup model, a hard model spend cap and a key-locked admin dashboard). On 22 October it went live on AWS (app.ic.rgproject.me): one EC2 instance runs the database, API, worker and web app under Docker Compose behind an HTTPS proxy, with uploads in Amazon S3 and nightly backups. No application code changed for it beyond signing upload links for the bucket’s regional host.</w:t>
       </w:r>
     </w:p>
     <w:tbl>
@@ -3176,7 +3302,7 @@
                 <w:sz w:val="18"/>
                 <w:szCs w:val="18"/>
               </w:rPr>
-              <w:t xml:space="preserve">Phases 0–6 done, plus cost controls and an admin dashboard (21 Oct); deployed to production on AWS (22 Oct), the first part of Phase 8; 7 (Q&amp;A) and the rest of 8 (staging, monitoring, audit log) not started; Release 1 alpha planned 11 Dec 2026</w:t>
+              <w:t xml:space="preserve">Phases 0-6 done, plus cost controls and an admin dashboard (21 Oct); deployed to production on AWS (22 Oct), the first part of Phase 8; 7 (Q&amp;A) and the rest of 8 (staging, monitoring, audit log) not started; Release 1 alpha planned 11 Dec 2026</w:t>
             </w:r>
           </w:p>
         </w:tc>
@@ -3244,7 +3370,7 @@
                 <w:sz w:val="20"/>
                 <w:szCs w:val="20"/>
               </w:rPr>
-              <w:t>The foundations are unusually solid for the project’s age: strong tenant isolation, a clean layered backend, provenance on every fact, and broad automated testing. The companion test report finds the security core sound but identifies correctness defects in data cleaning that must be fixed before real users rely on it, and a broken language-model path (F-01, fixed on 19 Oct), and notes that production operations are only partly built: since 22 Oct 2026 the product runs on one AWS host with nightly backups, but staging, monitoring and an audit log are still missing.</w:t>
+              <w:t xml:space="preserve">The foundations are solid for a project this young: strong tenant isolation, a clean layered backend, provenance on every fact, and broad automated testing. The companion test report finds the security core sound but identifies correctness defects in data cleaning that must be fixed before real users rely on it, and a broken language-model path (F-01, fixed on 19 Oct), and notes that production operations are only partly built: since 22 Oct 2026 the product runs on one AWS host with nightly backups, but staging, monitoring and an audit log are still missing.</w:t>
             </w:r>
           </w:p>
         </w:tc>
@@ -4162,7 +4288,15 @@
         <w:spacing w:after="120" w:line="276"/>
       </w:pPr>
       <w:r>
-        <w:t xml:space="preserve">People with a spreadsheet want answers, not a statistics course. General-purpose AI assistants produce fluent analyses, but their numbers can be invented, their cleaning is invisible, and sending raw rows to a model is unacceptable for sensitive data. Traditional BI tools are accurate but need a skilled analyst to ask the right questions and prepare the data.</w:t>
+        <w:t xml:space="preserve">The idea started from a question. Language models can handle almost any text, and newer systems can predict on tabular data without being retrained each time. So why not a system that gives a detailed analysis while keeping the data private and without needing a data analytics specialist? People with a spreadsheet want answers, and most of them have no statistics background. General-purpose AI assistants produce fluent analyses, but their numbers can be invented, their cleaning is invisible, and sending raw rows to a model is unacceptable for sensitive data. Traditional BI tools are accurate but need a skilled analyst to ask the right questions and prepare the data.</w:t>
+      </w:r>
+    </w:p>
+    <w:p>
+      <w:pPr>
+        <w:spacing w:after="120" w:line="276"/>
+      </w:pPr>
+      <w:r>
+        <w:t xml:space="preserve">InsightfulCell aims to make an analysis as easy as asking an assistant and as trustworthy as one done by a careful analyst. The site states it in three lines: “Your one stop solution for data analysis.” “Bring a spreadsheet. Leave with clear answers, charts and a report your team can check.” “We respect your data privacy. Raw rows never reach an AI model.”</w:t>
       </w:r>
     </w:p>
     <w:p>
@@ -6115,7 +6249,7 @@
                 <w:sz w:val="17"/>
                 <w:szCs w:val="17"/>
               </w:rPr>
-              <w:t xml:space="preserve">Email + password sign-in, Google (optional), email links</w:t>
+              <w:t xml:space="preserve">Email and password sign-in</w:t>
             </w:r>
           </w:p>
         </w:tc>
@@ -6145,7 +6279,7 @@
                 <w:sz w:val="17"/>
                 <w:szCs w:val="17"/>
               </w:rPr>
-              <w:t xml:space="preserve">✓ / ✓ / ◐</w:t>
+              <w:t xml:space="preserve">✓</w:t>
             </w:r>
           </w:p>
         </w:tc>
@@ -6175,7 +6309,7 @@
                 <w:sz w:val="17"/>
                 <w:szCs w:val="17"/>
               </w:rPr>
-              <w:t xml:space="preserve">Links off by default (ADR-033); when on, a separate page sends them only to EMAIL_LINK_ALLOWED_EMAILS; registration confirms the password; GitHub not built</w:t>
+              <w:t xml:space="preserve">Registration asks for the password twice; password fields have a show/hide toggle</w:t>
             </w:r>
           </w:p>
         </w:tc>
@@ -8750,7 +8884,7 @@
         <w:spacing w:after="120" w:line="276"/>
       </w:pPr>
       <w:r>
-        <w:t xml:space="preserve">Layer rules are enforced by </w:t>
+        <w:t xml:space="preserve">Import-linter enforces the layer rules with six contracts: domain has no I/O;</w:t>
       </w:r>
       <w:r>
         <w:rPr>
@@ -8758,10 +8892,10 @@
           <w:sz w:val="19"/>
           <w:szCs w:val="19"/>
         </w:rPr>
-        <w:t xml:space="preserve">import-linter</w:t>
+        <w:t xml:space="preserve"/>
       </w:r>
       <w:r>
-        <w:t xml:space="preserve"> (six contracts), not by convention: </w:t>
+        <w:t xml:space="preserve"/>
       </w:r>
       <w:r>
         <w:rPr>
@@ -8769,10 +8903,10 @@
           <w:sz w:val="19"/>
           <w:szCs w:val="19"/>
         </w:rPr>
-        <w:t xml:space="preserve">domain</w:t>
+        <w:t xml:space="preserve"/>
       </w:r>
       <w:r>
-        <w:t xml:space="preserve"> has no I/O; </w:t>
+        <w:t xml:space="preserve"> </w:t>
       </w:r>
       <w:r>
         <w:rPr>
@@ -10511,7 +10645,7 @@
                 <w:sz w:val="18"/>
                 <w:szCs w:val="18"/>
               </w:rPr>
-              <w:t xml:space="preserve">Email-and-password registration alongside links and Google</w:t>
+              <w:t xml:space="preserve">Email-and-password registration</w:t>
             </w:r>
           </w:p>
         </w:tc>
@@ -10530,24 +10664,25 @@
               <w:bottom w:val="single" w:color="C9D3D0" w:sz="4"/>
               <w:right w:val="single" w:color="C9D3D0" w:sz="4"/>
             </w:tcBorders>
-            <w:tcMar>
-              <w:top w:type="dxa" w:w="70"/>
-              <w:left w:type="dxa" w:w="110"/>
-              <w:bottom w:type="dxa" w:w="70"/>
-              <w:right w:type="dxa" w:w="110"/>
-            </w:tcMar>
-            <w:vAlign w:val="top"/>
-          </w:tcPr>
-          <w:p>
-            <w:pPr>
-              <w:spacing w:after="40"/>
-            </w:pPr>
-            <w:r>
-              <w:rPr>
-                <w:sz w:val="18"/>
-                <w:szCs w:val="18"/>
-              </w:rPr>
-              <w:t xml:space="preserve">029</w:t>
+            <w:shd w:fill="F6F8F7" w:color="auto" w:val="clear"/>
+            <w:tcMar>
+              <w:top w:type="dxa" w:w="70"/>
+              <w:left w:type="dxa" w:w="110"/>
+              <w:bottom w:type="dxa" w:w="70"/>
+              <w:right w:type="dxa" w:w="110"/>
+            </w:tcMar>
+            <w:vAlign w:val="top"/>
+          </w:tcPr>
+          <w:p>
+            <w:pPr>
+              <w:spacing w:after="40"/>
+            </w:pPr>
+            <w:r>
+              <w:rPr>
+                <w:sz w:val="18"/>
+                <w:szCs w:val="18"/>
+              </w:rPr>
+              <w:t xml:space="preserve">030</w:t>
             </w:r>
           </w:p>
         </w:tc>
@@ -10560,24 +10695,25 @@
               <w:bottom w:val="single" w:color="C9D3D0" w:sz="4"/>
               <w:right w:val="single" w:color="C9D3D0" w:sz="4"/>
             </w:tcBorders>
-            <w:tcMar>
-              <w:top w:type="dxa" w:w="70"/>
-              <w:left w:type="dxa" w:w="110"/>
-              <w:bottom w:type="dxa" w:w="70"/>
-              <w:right w:type="dxa" w:w="110"/>
-            </w:tcMar>
-            <w:vAlign w:val="top"/>
-          </w:tcPr>
-          <w:p>
-            <w:pPr>
-              <w:spacing w:after="40"/>
-            </w:pPr>
-            <w:r>
-              <w:rPr>
-                <w:sz w:val="18"/>
-                <w:szCs w:val="18"/>
-              </w:rPr>
-              <w:t xml:space="preserve">Testers may send sign-in links with their own Resend key (removed 21 Oct 2026)</w:t>
+            <w:shd w:fill="F6F8F7" w:color="auto" w:val="clear"/>
+            <w:tcMar>
+              <w:top w:type="dxa" w:w="70"/>
+              <w:left w:type="dxa" w:w="110"/>
+              <w:bottom w:type="dxa" w:w="70"/>
+              <w:right w:type="dxa" w:w="110"/>
+            </w:tcMar>
+            <w:vAlign w:val="top"/>
+          </w:tcPr>
+          <w:p>
+            <w:pPr>
+              <w:spacing w:after="40"/>
+            </w:pPr>
+            <w:r>
+              <w:rPr>
+                <w:sz w:val="18"/>
+                <w:szCs w:val="18"/>
+              </w:rPr>
+              <w:t xml:space="preserve">Runs on a PostgreSQL job queue; live progress streamed straight from the API</w:t>
             </w:r>
           </w:p>
         </w:tc>
@@ -10596,25 +10732,24 @@
               <w:bottom w:val="single" w:color="C9D3D0" w:sz="4"/>
               <w:right w:val="single" w:color="C9D3D0" w:sz="4"/>
             </w:tcBorders>
-            <w:shd w:fill="F6F8F7" w:color="auto" w:val="clear"/>
-            <w:tcMar>
-              <w:top w:type="dxa" w:w="70"/>
-              <w:left w:type="dxa" w:w="110"/>
-              <w:bottom w:type="dxa" w:w="70"/>
-              <w:right w:type="dxa" w:w="110"/>
-            </w:tcMar>
-            <w:vAlign w:val="top"/>
-          </w:tcPr>
-          <w:p>
-            <w:pPr>
-              <w:spacing w:after="40"/>
-            </w:pPr>
-            <w:r>
-              <w:rPr>
-                <w:sz w:val="18"/>
-                <w:szCs w:val="18"/>
-              </w:rPr>
-              <w:t xml:space="preserve">030</w:t>
+            <w:tcMar>
+              <w:top w:type="dxa" w:w="70"/>
+              <w:left w:type="dxa" w:w="110"/>
+              <w:bottom w:type="dxa" w:w="70"/>
+              <w:right w:type="dxa" w:w="110"/>
+            </w:tcMar>
+            <w:vAlign w:val="top"/>
+          </w:tcPr>
+          <w:p>
+            <w:pPr>
+              <w:spacing w:after="40"/>
+            </w:pPr>
+            <w:r>
+              <w:rPr>
+                <w:sz w:val="18"/>
+                <w:szCs w:val="18"/>
+              </w:rPr>
+              <w:t xml:space="preserve">031</w:t>
             </w:r>
           </w:p>
         </w:tc>
@@ -10627,25 +10762,24 @@
               <w:bottom w:val="single" w:color="C9D3D0" w:sz="4"/>
               <w:right w:val="single" w:color="C9D3D0" w:sz="4"/>
             </w:tcBorders>
-            <w:shd w:fill="F6F8F7" w:color="auto" w:val="clear"/>
-            <w:tcMar>
-              <w:top w:type="dxa" w:w="70"/>
-              <w:left w:type="dxa" w:w="110"/>
-              <w:bottom w:type="dxa" w:w="70"/>
-              <w:right w:type="dxa" w:w="110"/>
-            </w:tcMar>
-            <w:vAlign w:val="top"/>
-          </w:tcPr>
-          <w:p>
-            <w:pPr>
-              <w:spacing w:after="40"/>
-            </w:pPr>
-            <w:r>
-              <w:rPr>
-                <w:sz w:val="18"/>
-                <w:szCs w:val="18"/>
-              </w:rPr>
-              <w:t xml:space="preserve">Runs on a PostgreSQL job queue; live progress streamed straight from the API</w:t>
+            <w:tcMar>
+              <w:top w:type="dxa" w:w="70"/>
+              <w:left w:type="dxa" w:w="110"/>
+              <w:bottom w:type="dxa" w:w="70"/>
+              <w:right w:type="dxa" w:w="110"/>
+            </w:tcMar>
+            <w:vAlign w:val="top"/>
+          </w:tcPr>
+          <w:p>
+            <w:pPr>
+              <w:spacing w:after="40"/>
+            </w:pPr>
+            <w:r>
+              <w:rPr>
+                <w:sz w:val="18"/>
+                <w:szCs w:val="18"/>
+              </w:rPr>
+              <w:t xml:space="preserve">One LLM gateway, four interchangeable providers, rules as the complete fallback</w:t>
             </w:r>
           </w:p>
         </w:tc>
@@ -10664,24 +10798,25 @@
               <w:bottom w:val="single" w:color="C9D3D0" w:sz="4"/>
               <w:right w:val="single" w:color="C9D3D0" w:sz="4"/>
             </w:tcBorders>
-            <w:tcMar>
-              <w:top w:type="dxa" w:w="70"/>
-              <w:left w:type="dxa" w:w="110"/>
-              <w:bottom w:type="dxa" w:w="70"/>
-              <w:right w:type="dxa" w:w="110"/>
-            </w:tcMar>
-            <w:vAlign w:val="top"/>
-          </w:tcPr>
-          <w:p>
-            <w:pPr>
-              <w:spacing w:after="40"/>
-            </w:pPr>
-            <w:r>
-              <w:rPr>
-                <w:sz w:val="18"/>
-                <w:szCs w:val="18"/>
-              </w:rPr>
-              <w:t xml:space="preserve">031</w:t>
+            <w:shd w:fill="F6F8F7" w:color="auto" w:val="clear"/>
+            <w:tcMar>
+              <w:top w:type="dxa" w:w="70"/>
+              <w:left w:type="dxa" w:w="110"/>
+              <w:bottom w:type="dxa" w:w="70"/>
+              <w:right w:type="dxa" w:w="110"/>
+            </w:tcMar>
+            <w:vAlign w:val="top"/>
+          </w:tcPr>
+          <w:p>
+            <w:pPr>
+              <w:spacing w:after="40"/>
+            </w:pPr>
+            <w:r>
+              <w:rPr>
+                <w:sz w:val="18"/>
+                <w:szCs w:val="18"/>
+              </w:rPr>
+              <w:t xml:space="preserve">032</w:t>
             </w:r>
           </w:p>
         </w:tc>
@@ -10694,42 +10829,6 @@
               <w:bottom w:val="single" w:color="C9D3D0" w:sz="4"/>
               <w:right w:val="single" w:color="C9D3D0" w:sz="4"/>
             </w:tcBorders>
-            <w:tcMar>
-              <w:top w:type="dxa" w:w="70"/>
-              <w:left w:type="dxa" w:w="110"/>
-              <w:bottom w:type="dxa" w:w="70"/>
-              <w:right w:type="dxa" w:w="110"/>
-            </w:tcMar>
-            <w:vAlign w:val="top"/>
-          </w:tcPr>
-          <w:p>
-            <w:pPr>
-              <w:spacing w:after="40"/>
-            </w:pPr>
-            <w:r>
-              <w:rPr>
-                <w:sz w:val="18"/>
-                <w:szCs w:val="18"/>
-              </w:rPr>
-              <w:t xml:space="preserve">One LLM gateway, four interchangeable providers, rules as the complete fallback</w:t>
-            </w:r>
-          </w:p>
-        </w:tc>
-      </w:tr>
-      <w:tr>
-        <w:trPr>
-          <w:cantSplit/>
-          <w:tblHeader w:val="off"/>
-        </w:trPr>
-        <w:tc>
-          <w:tcPr>
-            <w:tcW w:type="dxa" w:w="1032"/>
-            <w:tcBorders>
-              <w:top w:val="single" w:color="C9D3D0" w:sz="4"/>
-              <w:left w:val="single" w:color="C9D3D0" w:sz="4"/>
-              <w:bottom w:val="single" w:color="C9D3D0" w:sz="4"/>
-              <w:right w:val="single" w:color="C9D3D0" w:sz="4"/>
-            </w:tcBorders>
             <w:shd w:fill="F6F8F7" w:color="auto" w:val="clear"/>
             <w:tcMar>
               <w:top w:type="dxa" w:w="70"/>
@@ -10748,104 +10847,7 @@
                 <w:sz w:val="18"/>
                 <w:szCs w:val="18"/>
               </w:rPr>
-              <w:t xml:space="preserve">032</w:t>
-            </w:r>
-          </w:p>
-        </w:tc>
-        <w:tc>
-          <w:tcPr>
-            <w:tcW w:type="dxa" w:w="8606"/>
-            <w:tcBorders>
-              <w:top w:val="single" w:color="C9D3D0" w:sz="4"/>
-              <w:left w:val="single" w:color="C9D3D0" w:sz="4"/>
-              <w:bottom w:val="single" w:color="C9D3D0" w:sz="4"/>
-              <w:right w:val="single" w:color="C9D3D0" w:sz="4"/>
-            </w:tcBorders>
-            <w:shd w:fill="F6F8F7" w:color="auto" w:val="clear"/>
-            <w:tcMar>
-              <w:top w:type="dxa" w:w="70"/>
-              <w:left w:type="dxa" w:w="110"/>
-              <w:bottom w:type="dxa" w:w="70"/>
-              <w:right w:type="dxa" w:w="110"/>
-            </w:tcMar>
-            <w:vAlign w:val="top"/>
-          </w:tcPr>
-          <w:p>
-            <w:pPr>
-              <w:spacing w:after="40"/>
-            </w:pPr>
-            <w:r>
-              <w:rPr>
-                <w:sz w:val="18"/>
-                <w:szCs w:val="18"/>
-              </w:rPr>
               <w:t xml:space="preserve">Phase B evidence: tested facts, one false-discovery family per run, packaged place data</w:t>
-            </w:r>
-          </w:p>
-        </w:tc>
-      </w:tr>
-      <w:tr>
-        <w:trPr>
-          <w:cantSplit/>
-          <w:tblHeader w:val="off"/>
-        </w:trPr>
-        <w:tc>
-          <w:tcPr>
-            <w:tcW w:type="dxa" w:w="1032"/>
-            <w:tcBorders>
-              <w:top w:val="single" w:color="C9D3D0" w:sz="4"/>
-              <w:left w:val="single" w:color="C9D3D0" w:sz="4"/>
-              <w:bottom w:val="single" w:color="C9D3D0" w:sz="4"/>
-              <w:right w:val="single" w:color="C9D3D0" w:sz="4"/>
-            </w:tcBorders>
-            <w:tcMar>
-              <w:top w:type="dxa" w:w="70"/>
-              <w:left w:type="dxa" w:w="110"/>
-              <w:bottom w:type="dxa" w:w="70"/>
-              <w:right w:type="dxa" w:w="110"/>
-            </w:tcMar>
-            <w:vAlign w:val="top"/>
-          </w:tcPr>
-          <w:p>
-            <w:pPr>
-              <w:spacing w:after="40"/>
-            </w:pPr>
-            <w:r>
-              <w:rPr>
-                <w:sz w:val="18"/>
-                <w:szCs w:val="18"/>
-              </w:rPr>
-              <w:t xml:space="preserve">033</w:t>
-            </w:r>
-          </w:p>
-        </w:tc>
-        <w:tc>
-          <w:tcPr>
-            <w:tcW w:type="dxa" w:w="8606"/>
-            <w:tcBorders>
-              <w:top w:val="single" w:color="C9D3D0" w:sz="4"/>
-              <w:left w:val="single" w:color="C9D3D0" w:sz="4"/>
-              <w:bottom w:val="single" w:color="C9D3D0" w:sz="4"/>
-              <w:right w:val="single" w:color="C9D3D0" w:sz="4"/>
-            </w:tcBorders>
-            <w:tcMar>
-              <w:top w:type="dxa" w:w="70"/>
-              <w:left w:type="dxa" w:w="110"/>
-              <w:bottom w:type="dxa" w:w="70"/>
-              <w:right w:type="dxa" w:w="110"/>
-            </w:tcMar>
-            <w:vAlign w:val="top"/>
-          </w:tcPr>
-          <w:p>
-            <w:pPr>
-              <w:spacing w:after="40"/>
-            </w:pPr>
-            <w:r>
-              <w:rPr>
-                <w:sz w:val="18"/>
-                <w:szCs w:val="18"/>
-              </w:rPr>
-              <w:t xml:space="preserve">Sign-in links off until a mail domain is verified</w:t>
             </w:r>
           </w:p>
         </w:tc>
@@ -11453,7 +11455,7 @@
         <w:t xml:space="preserve">app/api/auth/[...all]</w:t>
       </w:r>
       <w:r>
-        <w:t xml:space="preserve"> hosts Better Auth: password, Google, organisations, JWKS; </w:t>
+        <w:t xml:space="preserve"> hosts Better Auth: password, organisations, JWKS; </w:t>
       </w:r>
       <w:r>
         <w:rPr>
@@ -11564,7 +11566,7 @@
         <w:t>components/report/data-sidebar.tsx</w:t>
       </w:r>
       <w:r>
-        <w:t>: “See the data” on the report and dashboard opens a side panel with the table as it was read, 100 rows a page, personal-data columns hidden. It takes 25% of the window by default and is resized (20–90%) by dragging its grip or with the arrow keys (ADR-040).</w:t>
+        <w:t>: “See the data” on the report and dashboard opens a side panel with the table as it was read, 100 rows a page, personal-data columns hidden. It takes 25% of the window by default and is resized (20-90%) by dragging its grip or with the arrow keys (ADR-040).</w:t>
       </w:r>
     </w:p>
     <w:p>
@@ -11581,10 +11583,10 @@
           <w:b/>
           <w:bCs/>
         </w:rPr>
-        <w:t xml:space="preserve">app/sign-in/email</w:t>
+        <w:t xml:space="preserve">Registration asks for the password twice, and password fields have a show/hide toggle.</w:t>
       </w:r>
       <w:r>
-        <w:t xml:space="preserve">: the email sign-in link page; links go only to addresses in EMAIL_LINK_ALLOWED_EMAILS, and anyone else is asked to register with a password. Registration asks for the password twice, and password fields have a show/hide toggle.</w:t>
+        <w:t xml:space="preserve"/>
       </w:r>
     </w:p>
     <w:p>
@@ -12525,7 +12527,7 @@
         <w:spacing w:after="120" w:line="276"/>
       </w:pPr>
       <w:r>
-        <w:t xml:space="preserve">The only code path allowed to call a model. It picks the model by purpose, enforces per-run and per-organisation token budgets and a requests-per-minute limit, blocks payloads containing personal data, reserves each attempt’s worst-case cost against hard spend caps (overall, per provider and per person, in AUD; a model without a price is never called), retries with backoff behind a circuit breaker, validates the response against a JSON schema and records every call (tokens, cost, latency, outcome — never prompt text) in </w:t>
+        <w:t xml:space="preserve">The only code path allowed to call a model. It picks the model by purpose, enforces per-run and per-organisation token budgets and a requests-per-minute limit, blocks payloads containing personal data, reserves each attempt’s worst-case cost against hard spend caps (overall, per provider and per person, in AUD; a model without a price is never called), retries with backoff behind a circuit breaker, validates the response against a JSON schema and records every call (tokens, cost, latency and outcome, never prompt text) in </w:t>
       </w:r>
       <w:r>
         <w:rPr>
@@ -15866,7 +15868,7 @@
                 <w:sz w:val="16"/>
                 <w:szCs w:val="16"/>
               </w:rPr>
-              <w:t xml:space="preserve">migrations 0005–0009</w:t>
+              <w:t xml:space="preserve">migrations 0005-0009</w:t>
             </w:r>
           </w:p>
         </w:tc>
@@ -19688,7 +19690,7 @@
         <w:spacing w:after="120" w:line="276"/>
       </w:pPr>
       <w:r>
-        <w:t>Re-run on 19 Oct 2026 after iterations 17–19: 496 backend unit and 179 integration tests, 391 frontend tests (axe included), ruff, mypy, import contracts, eslint, tsc and the production build pass; a live Gemini run through an ngrok tunnel reached the report. make check as a whole and the browser journeys were not re-run.</w:t>
+        <w:t>Re-run on 19 Oct 2026 after iterations 17-19: 496 backend unit and 179 integration tests, 391 frontend tests (axe included), ruff, mypy, import contracts, eslint, tsc and the production build pass; a live Gemini run through an ngrok tunnel reached the report. make check as a whole and the browser journeys were not re-run.</w:t>
       </w:r>
     </w:p>
     <w:p>
@@ -20897,7 +20899,7 @@
                 <w:sz w:val="18"/>
                 <w:szCs w:val="18"/>
               </w:rPr>
-              <w:t xml:space="preserve">Split view, tiers 0–2, six tools, quotas, answer cache</w:t>
+              <w:t xml:space="preserve">Split view, tiers 0-2, six tools, quotas, answer cache</w:t>
             </w:r>
           </w:p>
         </w:tc>
@@ -24472,7 +24474,7 @@
         <w:spacing w:after="120" w:line="276"/>
       </w:pPr>
       <w:r>
-        <w:t xml:space="preserve">InsightfulCell has built, in a short time, the difficult core that most AI analytics products skip: tenant isolation enforced in the database, provenance for every number, statistical control of false discoveries, charts that are recomputed before display, and a model boundary that keeps raw data private. The system is well structured and well tested at the unit and journey level.</w:t>
+        <w:t xml:space="preserve">In a short time InsightfulCell has built the hard core of the product: tenant isolation enforced in the database, provenance for every number, statistical control of false discoveries, charts that are recomputed before display, and a model boundary that keeps raw data private. The system is well structured and well tested at the unit and journey level.</w:t>
       </w:r>
     </w:p>
     <w:p>
@@ -24480,7 +24482,7 @@
         <w:spacing w:after="120" w:line="276"/>
       </w:pPr>
       <w:r>
-        <w:t>To serve real users with sensitive data, three things must happen next: make data preparation as trustworthy as the statistics that follow it, keep the now-working model path tested live, and build the operational layer (monitoring, backups, rate limits, audit). With those in place the product’s central promise — every number shows its work — is credible and defensible.</w:t>
+        <w:t xml:space="preserve">To serve real users with sensitive data, three things must happen next: make data preparation as trustworthy as the statistics that follow it, keep the now-working model path tested live, and build the operational layer (monitoring, backups, rate limits, audit). With those in place the product can stand behind what its site promises: one stop for data analysis, every number showing its work, and raw rows that never reach an AI model.</w:t>
       </w:r>
     </w:p>
     <w:p>
@@ -27336,7 +27338,7 @@
                 <w:sz w:val="17"/>
                 <w:szCs w:val="17"/>
               </w:rPr>
-              <w:t xml:space="preserve">Alembic migrations 0001–0012</w:t>
+              <w:t xml:space="preserve">Alembic migrations 0001-0012</w:t>
             </w:r>
           </w:p>
         </w:tc>

</xml_diff>